<commit_message>
Make per-carbon potential the main Q2 version (D11)
Biomass-normalized potential, dominated by two low-MBC samples, becomes
robustness variant (a). Q2 results, figures, Checkpoint 4 report, and
storyboard v5 regenerated. Permutation and bootstrap calls are now seeded
per call so a variant's result does not depend on run order.

Co-Authored-By: Claude Opus 5.5 <noreply@anthropic.com>
</commit_message>
<xml_diff>
--- a/Docs/Storyboard_v5.docx
+++ b/Docs/Storyboard_v5.docx
@@ -593,7 +593,7 @@
               <w:rPr>
                 <w:sz w:val="18"/>
               </w:rPr>
-              <w:t xml:space="preserve">13 of 19 compounds matched; that is not more than chance (p = 0.17).</w:t>
+              <w:t xml:space="preserve">11 of 19 compounds matched; that is not more than chance (p = 0.65).</w:t>
             </w:r>
           </w:p>
         </w:tc>
@@ -647,7 +647,7 @@
               <w:rPr>
                 <w:sz w:val="18"/>
               </w:rPr>
-              <w:t xml:space="preserve">Outside-the-cell gene sets leaned toward a lag (difference 0.38, p = 0.077), but the result weakened in checks.</w:t>
+              <w:t xml:space="preserve">Outside-the-cell gene sets leaned toward a lag (difference 0.31, p = 0.09), but the result weakened in checks.</w:t>
             </w:r>
           </w:p>
         </w:tc>
@@ -881,7 +881,7 @@
     </w:p>
     <w:p>
       <w:r>
-        <w:t xml:space="preserve">We compared each compound's change between seasons in genes and in readiness (H2b). We also asked whether readiness matched gene expression from the same month or from the month before (H2c). In the plan, readiness for Q2 is divided by microbial biomass. As explained below, two samples with almost no measured biomass dominated that version, so we also show the version without that step.</w:t>
+        <w:t xml:space="preserve">We compared each compound's change between seasons in genes and in readiness (H2b). We also asked whether readiness matched gene expression from the same month or from the month before (H2c). The plan divided readiness by microbial biomass for Q2. Two samples with almost no measured biomass dominated that version, so we use readiness per unit carbon as the main version. This was a change to the plan, decided after seeing the results; the biomass version is shown as a check.</w:t>
       </w:r>
     </w:p>
     <w:p>
@@ -1482,7 +1482,7 @@
         <w:rPr>
           <w:sz w:val="19"/>
         </w:rPr>
-        <w:t xml:space="preserve">Each point is one compound. Across: how much readiness changed from summer to winter. Up: how much its genes changed. Points in the top-right or bottom-left boxes changed the same way in both (a match). Left panel: readiness divided by microbial biomass, as in the plan. Right panel: readiness per unit carbon, without that step.</w:t>
+        <w:t xml:space="preserve">Each point is one compound. Across: how much readiness changed from summer to winter. Up: how much its genes changed. Points in the top-right or bottom-left boxes changed the same way in both (a match). Left panel: readiness per unit carbon (main version). Right panel: readiness divided by microbial biomass, as first planned.</w:t>
       </w:r>
     </w:p>
     <w:p>
@@ -1502,7 +1502,7 @@
         </w:numPr>
       </w:pPr>
       <w:r>
-        <w:t xml:space="preserve">Left panel: 13 of 19 compounds matched (p = 0.17); the correlation was weak (rho = 0.34, p = 0.16). Almost every compound sits at the same spot across, because one sample with almost no biomass drives all of them.</w:t>
+        <w:t xml:space="preserve">Left panel: 11 of 19 compounds matched, about what chance would give (p = 0.65). The correlation was weak (rho = 0.16, p = 0.52).</w:t>
       </w:r>
     </w:p>
     <w:p>
@@ -1514,7 +1514,7 @@
         </w:numPr>
       </w:pPr>
       <w:r>
-        <w:t xml:space="preserve">Right panel: 11 of 19 matched (p = 0.65; rho = 0.16).</w:t>
+        <w:t xml:space="preserve">Readiness rose in winter for 15 of 19 compounds, while genes fell for 12 of 19.</w:t>
       </w:r>
     </w:p>
     <w:p>
@@ -1526,7 +1526,7 @@
         </w:numPr>
       </w:pPr>
       <w:r>
-        <w:t xml:space="preserve">Without the two low-biomass samples: 12 of 19 matched (p = 0.36).</w:t>
+        <w:t xml:space="preserve">Right panel (biomass version): 13 of 19 matched (p = 0.17), but almost every compound sits at the same spot across, because one sample with almost no biomass drives all of them.</w:t>
       </w:r>
     </w:p>
     <w:p>
@@ -1538,7 +1538,19 @@
         </w:numPr>
       </w:pPr>
       <w:r>
-        <w:t xml:space="preserve">A typical pattern (right panel): readiness for glycine, alanine, and leucine went up in winter while their genes went down.</w:t>
+        <w:t xml:space="preserve">Using only the most certain genes: 8 of 17 matched (p = 1).</w:t>
+      </w:r>
+    </w:p>
+    <w:p>
+      <w:pPr>
+        <w:pStyle w:val="ListBullet"/>
+        <w:numPr>
+          <w:ilvl w:val="0"/>
+          <w:numId w:val="1"/>
+        </w:numPr>
+      </w:pPr>
+      <w:r>
+        <w:t xml:space="preserve">A typical pattern (left panel): readiness for glycine, alanine, and leucine went up in winter while their genes went down.</w:t>
       </w:r>
     </w:p>
     <w:p>
@@ -1641,7 +1653,7 @@
         </w:numPr>
       </w:pPr>
       <w:r>
-        <w:t xml:space="preserve">Outside the cell, 7 of 10 gene sets fit the previous month better; inside the cell, 7 of 16.</w:t>
+        <w:t xml:space="preserve">Outside the cell, 7 of 10 gene sets fit the previous month better; inside the cell, 9 of 16.</w:t>
       </w:r>
     </w:p>
     <w:p>
@@ -1653,7 +1665,7 @@
         </w:numPr>
       </w:pPr>
       <w:r>
-        <w:t xml:space="preserve">On average, outside-the-cell sets had a larger lag advantage than inside-the-cell sets (by 0.38, p = 0.077). This is the direction H2c predicted, but it is above the usual 0.05 line.</w:t>
+        <w:t xml:space="preserve">On average, outside-the-cell sets had a larger lag advantage than inside-the-cell sets (by 0.31, p = 0.09). This is the direction H2c predicted, but it is above the usual 0.05 line.</w:t>
       </w:r>
     </w:p>
     <w:p>
@@ -1665,7 +1677,7 @@
         </w:numPr>
       </w:pPr>
       <w:r>
-        <w:t xml:space="preserve">Only two sets showed a clear lag on their own: the AP and Ala enzymes. One showed the reverse: the N-acetylglucosamine uptake set.</w:t>
+        <w:t xml:space="preserve">Only two sets showed a clear lag on their own: the AP and Ala enzymes. No set showed a clear reverse.</w:t>
       </w:r>
     </w:p>
     <w:p>
@@ -1677,7 +1689,7 @@
         </w:numPr>
       </w:pPr>
       <w:r>
-        <w:t xml:space="preserve">Without the two low-biomass samples, the group difference shrank to 0.19 (p = 0.43).</w:t>
+        <w:t xml:space="preserve">With the biomass version of readiness, the group difference was 0.38 (p = 0.079); using only the most certain genes, 0.23 (p = 0.17).</w:t>
       </w:r>
     </w:p>
     <w:p>
@@ -1689,7 +1701,7 @@
         </w:numPr>
       </w:pPr>
       <w:r>
-        <w:t xml:space="preserve">A second check, sample by sample, pointed the other way: the previous month fit better for 14 of 16 inside-the-cell sets but only 2 of 10 outside-the-cell sets.</w:t>
+        <w:t xml:space="preserve">A second check, sample by sample, mostly favoured the same month: the previous month fit better for only 5 of 16 inside-the-cell sets and 0 of 10 outside-the-cell sets.</w:t>
       </w:r>
     </w:p>
     <w:p>

</xml_diff>